<commit_message>
docs: completar numeros de PR (#3-#8) en el reporte de parches
</commit_message>
<xml_diff>
--- a/docs/Fase3_Reporte_Tecnico_de_Parches.docx
+++ b/docs/Fase3_Reporte_Tecnico_de_Parches.docx
@@ -372,7 +372,7 @@
                 <w:b/>
                 <w:color w:val="FFFFFF"/>
               </w:rPr>
-              <w:t>Enlace al PR</w:t>
+              <w:t>Pull Request</w:t>
             </w:r>
           </w:p>
         </w:tc>
@@ -439,7 +439,7 @@
           <w:p>
             <w:r/>
             <w:r>
-              <w:t>_(completar nº de PR)_</w:t>
+              <w:t>https://github.com/Annn13/DVBLab/pull/4</w:t>
             </w:r>
           </w:p>
         </w:tc>
@@ -506,7 +506,7 @@
           <w:p>
             <w:r/>
             <w:r>
-              <w:t>_(completar nº de PR)_</w:t>
+              <w:t>https://github.com/Annn13/DVBLab/pull/5</w:t>
             </w:r>
           </w:p>
         </w:tc>
@@ -573,7 +573,7 @@
           <w:p>
             <w:r/>
             <w:r>
-              <w:t>_(completar nº de PR)_</w:t>
+              <w:t>https://github.com/Annn13/DVBLab/pull/6</w:t>
             </w:r>
           </w:p>
         </w:tc>
@@ -640,7 +640,7 @@
           <w:p>
             <w:r/>
             <w:r>
-              <w:t>_(completar nº de PR)_</w:t>
+              <w:t>https://github.com/Annn13/DVBLab/pull/7</w:t>
             </w:r>
           </w:p>
         </w:tc>
@@ -671,7 +671,7 @@
         <w:t>fa9a80d</w:t>
       </w:r>
       <w:r>
-        <w:t xml:space="preserve">): </w:t>
+        <w:t xml:space="preserve">, PR https://github.com/Annn13/DVBLab/pull/3): </w:t>
       </w:r>
       <w:r>
         <w:rPr>
@@ -726,7 +726,7 @@
         <w:t>requirements.txt</w:t>
       </w:r>
       <w:r>
-        <w:t>.</w:t>
+        <w:t>. Documentación: PR https://github.com/Annn13/DVBLab/pull/8.</w:t>
       </w:r>
     </w:p>
     <w:p>

</xml_diff>